<commit_message>
FCT : finalisation TDA
finalisation du TDA
</commit_message>
<xml_diff>
--- a/Tableau fixe.docx
+++ b/Tableau fixe.docx
@@ -104,7 +104,7 @@
       </w:tr>
       <w:tr>
         <w:trPr>
-          <w:trHeight w:val="2679"/>
+          <w:trHeight w:val="3523"/>
         </w:trPr>
         <w:tc>
           <w:tcPr>
@@ -194,7 +194,100 @@
               </w:numPr>
             </w:pPr>
             <w:r>
-              <w:t>remplis : TableauFixe x Élément -&gt; Élément</w:t>
+              <w:t>remplis : TableauFixe</w:t>
+            </w:r>
+            <w:r>
+              <w:t>,</w:t>
+            </w:r>
+            <w:r>
+              <w:t xml:space="preserve"> </w:t>
+            </w:r>
+            <w:r>
+              <w:t xml:space="preserve">entier </w:t>
+            </w:r>
+            <w:r>
+              <w:t>-&gt; Élément</w:t>
+            </w:r>
+          </w:p>
+          <w:p>
+            <w:pPr>
+              <w:pStyle w:val="Paragraphedeliste"/>
+              <w:numPr>
+                <w:ilvl w:val="0"/>
+                <w:numId w:val="3"/>
+              </w:numPr>
+            </w:pPr>
+            <w:r>
+              <w:t>é</w:t>
+            </w:r>
+            <w:r>
+              <w:t>change : TableauFixe</w:t>
+            </w:r>
+            <w:r>
+              <w:t>,</w:t>
+            </w:r>
+            <w:r>
+              <w:t xml:space="preserve"> TableauFixe </w:t>
+            </w:r>
+            <w:r>
+              <w:t xml:space="preserve">-&gt; </w:t>
+            </w:r>
+            <w:r>
+              <w:t>TableauFixe, TableauFixe</w:t>
+            </w:r>
+          </w:p>
+          <w:p>
+            <w:pPr>
+              <w:pStyle w:val="Paragraphedeliste"/>
+              <w:numPr>
+                <w:ilvl w:val="0"/>
+                <w:numId w:val="3"/>
+              </w:numPr>
+            </w:pPr>
+            <w:r>
+              <w:t>fusion : TableauFixe</w:t>
+            </w:r>
+            <w:r>
+              <w:t>,</w:t>
+            </w:r>
+            <w:r>
+              <w:t xml:space="preserve"> TableauFixe </w:t>
+            </w:r>
+            <w:r>
+              <w:t>-&gt;</w:t>
+            </w:r>
+            <w:r>
+              <w:t xml:space="preserve"> TableauFixe</w:t>
+            </w:r>
+          </w:p>
+          <w:p>
+            <w:pPr>
+              <w:pStyle w:val="Paragraphedeliste"/>
+              <w:numPr>
+                <w:ilvl w:val="0"/>
+                <w:numId w:val="3"/>
+              </w:numPr>
+            </w:pPr>
+            <w:r>
+              <w:t>sousEnsemble</w:t>
+            </w:r>
+            <w:r>
+              <w:t>&lt;M&gt;</w:t>
+            </w:r>
+            <w:r>
+              <w:t>: TableauFixe</w:t>
+            </w:r>
+            <w:r>
+              <w:t>,</w:t>
+            </w:r>
+            <w:r>
+              <w:t xml:space="preserve"> Taille </w:t>
+            </w:r>
+            <w:r>
+              <w:t>-&gt;</w:t>
+            </w:r>
+            <w:r>
+              <w:t xml:space="preserve"> TableauFixe</w:t>
             </w:r>
           </w:p>
         </w:tc>
@@ -1167,7 +1260,6 @@
   <w:style w:type="character" w:default="1" w:styleId="Policepardfaut">
     <w:name w:val="Default Paragraph Font"/>
     <w:uiPriority w:val="1"/>
-    <w:semiHidden/>
     <w:unhideWhenUsed/>
   </w:style>
   <w:style w:type="table" w:default="1" w:styleId="TableauNormal">
@@ -1499,6 +1591,16 @@
         <w:insideV w:val="single" w:sz="4" w:space="0" w:color="auto"/>
       </w:tblBorders>
     </w:tblPr>
+  </w:style>
+  <w:style w:type="character" w:styleId="Textedelespacerserv">
+    <w:name w:val="Placeholder Text"/>
+    <w:basedOn w:val="Policepardfaut"/>
+    <w:uiPriority w:val="99"/>
+    <w:semiHidden/>
+    <w:rsid w:val="003D2D02"/>
+    <w:rPr>
+      <w:color w:val="666666"/>
+    </w:rPr>
   </w:style>
 </w:styles>
 </file>

</xml_diff>